<commit_message>
docs: add submission and completed script
</commit_message>
<xml_diff>
--- a/churaa1_CheckPoint2_S22026.docx
+++ b/churaa1_CheckPoint2_S22026.docx
@@ -1,42 +1,22 @@
 
 <file path=word/document.xml><?xml version="1.0" encoding="utf-8"?>
-<w:document xmlns:wpc="http://schemas.microsoft.com/office/word/2010/wordprocessingCanvas" xmlns:cx="http://schemas.microsoft.com/office/drawing/2014/chartex" xmlns:cx1="http://schemas.microsoft.com/office/drawing/2015/9/8/chartex" xmlns:cx2="http://schemas.microsoft.com/office/drawing/2015/10/21/chartex" xmlns:cx3="http://schemas.microsoft.com/office/drawing/2016/5/9/chartex" xmlns:cx4="http://schemas.microsoft.com/office/drawing/2016/5/10/chartex" xmlns:cx5="http://schemas.microsoft.com/office/drawing/2016/5/11/chartex" xmlns:cx6="http://schemas.microsoft.com/office/drawing/2016/5/12/chartex" xmlns:cx7="http://schemas.microsoft.com/office/drawing/2016/5/13/chartex" xmlns:cx8="http://schemas.microsoft.com/office/drawing/2016/5/14/chartex" xmlns:mc="http://schemas.openxmlformats.org/markup-compatibility/2006" xmlns:aink="http://schemas.microsoft.com/office/drawing/2016/ink" xmlns:am3d="http://schemas.microsoft.com/office/drawing/2017/model3d" xmlns:o="urn:schemas-microsoft-com:office:office" xmlns:oel="http://schemas.microsoft.com/office/2019/extlst" xmlns:r="http://schemas.openxmlformats.org/officeDocument/2006/relationships" xmlns:m="http://schemas.openxmlformats.org/officeDocument/2006/math" xmlns:v="urn:schemas-microsoft-com:vml" xmlns:wp14="http://schemas.microsoft.com/office/word/2010/wordprocessingDrawing" xmlns:wp="http://schemas.openxmlformats.org/drawingml/2006/wordprocessingDrawing" xmlns:w10="urn:schemas-microsoft-com:office:word" xmlns:w="http://schemas.openxmlformats.org/wordprocessingml/2006/main" xmlns:w14="http://schemas.microsoft.com/office/word/2010/wordml" xmlns:w15="http://schemas.microsoft.com/office/word/2012/wordml" xmlns:w16cei="http://schemas.microsoft.com/office/word/2026/wordml/cei" xmlns:w16cex="http://schemas.microsoft.com/office/word/2018/wordml/cex" xmlns:w16cid="http://schemas.microsoft.com/office/word/2016/wordml/cid" xmlns:w16="http://schemas.microsoft.com/office/word/2018/wordml" xmlns:w16du="http://schemas.microsoft.com/office/word/2023/wordml/word16du" xmlns:w16sdtdh="http://schemas.microsoft.com/office/word/2020/wordml/sdtdatahash" xmlns:w16sdtfl="http://schemas.microsoft.com/office/word/2024/wordml/sdtformatlock" xmlns:w16se="http://schemas.microsoft.com/office/word/2015/wordml/symex" xmlns:wpg="http://schemas.microsoft.com/office/word/2010/wordprocessingGroup" xmlns:wpi="http://schemas.microsoft.com/office/word/2010/wordprocessingInk" xmlns:wne="http://schemas.microsoft.com/office/word/2006/wordml" xmlns:wps="http://schemas.microsoft.com/office/word/2010/wordprocessingShape" mc:Ignorable="w14 w15 w16se w16cid w16 w16cex w16sdtdh w16sdtfl w16du wp14">
+<w:document xmlns:wpc="http://schemas.microsoft.com/office/word/2010/wordprocessingCanvas" xmlns:cx="http://schemas.microsoft.com/office/drawing/2014/chartex" xmlns:cx1="http://schemas.microsoft.com/office/drawing/2015/9/8/chartex" xmlns:cx2="http://schemas.microsoft.com/office/drawing/2015/10/21/chartex" xmlns:cx3="http://schemas.microsoft.com/office/drawing/2016/5/9/chartex" xmlns:cx4="http://schemas.microsoft.com/office/drawing/2016/5/10/chartex" xmlns:cx5="http://schemas.microsoft.com/office/drawing/2016/5/11/chartex" xmlns:cx6="http://schemas.microsoft.com/office/drawing/2016/5/12/chartex" xmlns:cx7="http://schemas.microsoft.com/office/drawing/2016/5/13/chartex" xmlns:cx8="http://schemas.microsoft.com/office/drawing/2016/5/14/chartex" xmlns:mc="http://schemas.openxmlformats.org/markup-compatibility/2006" xmlns:aink="http://schemas.microsoft.com/office/drawing/2016/ink" xmlns:am3d="http://schemas.microsoft.com/office/drawing/2017/model3d" xmlns:o="urn:schemas-microsoft-com:office:office" xmlns:oel="http://schemas.microsoft.com/office/2019/extlst" xmlns:r="http://schemas.openxmlformats.org/officeDocument/2006/relationships" xmlns:m="http://schemas.openxmlformats.org/officeDocument/2006/math" xmlns:v="urn:schemas-microsoft-com:vml" xmlns:wp14="http://schemas.microsoft.com/office/word/2010/wordprocessingDrawing" xmlns:wp="http://schemas.openxmlformats.org/drawingml/2006/wordprocessingDrawing" xmlns:w10="urn:schemas-microsoft-com:office:word" xmlns:w="http://schemas.openxmlformats.org/wordprocessingml/2006/main" xmlns:w14="http://schemas.microsoft.com/office/word/2010/wordml" xmlns:w15="http://schemas.microsoft.com/office/word/2012/wordml" xmlns:w16cex="http://schemas.microsoft.com/office/word/2018/wordml/cex" xmlns:w16cid="http://schemas.microsoft.com/office/word/2016/wordml/cid" xmlns:w16="http://schemas.microsoft.com/office/word/2018/wordml" xmlns:w16du="http://schemas.microsoft.com/office/word/2023/wordml/word16du" xmlns:w16sdtdh="http://schemas.microsoft.com/office/word/2020/wordml/sdtdatahash" xmlns:w16sdtfl="http://schemas.microsoft.com/office/word/2024/wordml/sdtformatlock" xmlns:w16se="http://schemas.microsoft.com/office/word/2015/wordml/symex" xmlns:wpg="http://schemas.microsoft.com/office/word/2010/wordprocessingGroup" xmlns:wpi="http://schemas.microsoft.com/office/word/2010/wordprocessingInk" xmlns:wne="http://schemas.microsoft.com/office/word/2006/wordml" xmlns:wps="http://schemas.microsoft.com/office/word/2010/wordprocessingShape" mc:Ignorable="w14 w15 w16se w16cid w16 w16cex w16sdtdh w16sdtfl w16du wp14">
   <w:body>
     <w:p>
       <w:pPr>
-        <w:pStyle w:val="ListParagraph"/>
-        <w:numPr>
-          <w:ilvl w:val="0"/>
-          <w:numId w:val="1"/>
-        </w:numPr>
-        <w:rPr>
-          <w:rFonts w:ascii="Arial" w:hAnsi="Arial" w:cs="Arial"/>
-        </w:rPr>
-      </w:pPr>
-      <w:r>
-        <w:rPr>
-          <w:rFonts w:ascii="Arial" w:hAnsi="Arial" w:cs="Arial"/>
-        </w:rPr>
-        <w:t xml:space="preserve">Extract top 5 </w:t>
-      </w:r>
-      <w:proofErr w:type="spellStart"/>
-      <w:r>
-        <w:rPr>
-          <w:rFonts w:ascii="Arial" w:hAnsi="Arial" w:cs="Arial"/>
-        </w:rPr>
-        <w:t>cpu</w:t>
-      </w:r>
-      <w:proofErr w:type="spellEnd"/>
-      <w:r>
-        <w:rPr>
-          <w:rFonts w:ascii="Arial" w:hAnsi="Arial" w:cs="Arial"/>
-        </w:rPr>
-        <w:t xml:space="preserve"> consuming processes.</w:t>
-      </w:r>
-    </w:p>
-    <w:p>
-      <w:pPr>
-        <w:pStyle w:val="ListParagraph"/>
+        <w:rPr>
+          <w:rFonts w:ascii="Arial" w:hAnsi="Arial" w:cs="Arial"/>
+        </w:rPr>
+      </w:pPr>
+      <w:r>
+        <w:rPr>
+          <w:rFonts w:ascii="Arial" w:hAnsi="Arial" w:cs="Arial"/>
+        </w:rPr>
+        <w:t>Extract top 5 cpu consuming processes.</w:t>
+      </w:r>
+    </w:p>
+    <w:p>
+      <w:pPr>
         <w:rPr>
           <w:rFonts w:ascii="Arial" w:hAnsi="Arial" w:cs="Arial"/>
         </w:rPr>
@@ -56,90 +36,23 @@
           <w:rFonts w:ascii="Arial" w:hAnsi="Arial" w:cs="Arial"/>
         </w:rPr>
       </w:pPr>
-      <w:proofErr w:type="spellStart"/>
-      <w:r>
-        <w:rPr>
-          <w:rFonts w:ascii="Arial" w:hAnsi="Arial" w:cs="Arial"/>
-        </w:rPr>
-        <w:t>ps</w:t>
-      </w:r>
-      <w:proofErr w:type="spellEnd"/>
-      <w:r>
-        <w:rPr>
-          <w:rFonts w:ascii="Arial" w:hAnsi="Arial" w:cs="Arial"/>
-        </w:rPr>
-        <w:t xml:space="preserve"> -</w:t>
-      </w:r>
-      <w:proofErr w:type="spellStart"/>
-      <w:r>
-        <w:rPr>
-          <w:rFonts w:ascii="Arial" w:hAnsi="Arial" w:cs="Arial"/>
-        </w:rPr>
-        <w:t>eo</w:t>
-      </w:r>
-      <w:proofErr w:type="spellEnd"/>
+      <w:r>
+        <w:rPr>
+          <w:rFonts w:ascii="Arial" w:hAnsi="Arial" w:cs="Arial"/>
+        </w:rPr>
+        <w:t>ps -eo pid=,pcpu=,pmem=,args=</w:t>
+      </w:r>
       <w:r>
         <w:rPr>
           <w:rFonts w:ascii="Arial" w:hAnsi="Arial" w:cs="Arial"/>
         </w:rPr>
         <w:t xml:space="preserve"> </w:t>
       </w:r>
-      <w:proofErr w:type="spellStart"/>
-      <w:r>
-        <w:rPr>
-          <w:rFonts w:ascii="Arial" w:hAnsi="Arial" w:cs="Arial"/>
-        </w:rPr>
-        <w:t>pid</w:t>
-      </w:r>
-      <w:proofErr w:type="spellEnd"/>
-      <w:proofErr w:type="gramStart"/>
-      <w:r>
-        <w:rPr>
-          <w:rFonts w:ascii="Arial" w:hAnsi="Arial" w:cs="Arial"/>
-        </w:rPr>
-        <w:t>=,</w:t>
-      </w:r>
-      <w:proofErr w:type="spellStart"/>
-      <w:r>
-        <w:rPr>
-          <w:rFonts w:ascii="Arial" w:hAnsi="Arial" w:cs="Arial"/>
-        </w:rPr>
-        <w:t>pcpu</w:t>
-      </w:r>
-      <w:proofErr w:type="spellEnd"/>
-      <w:r>
-        <w:rPr>
-          <w:rFonts w:ascii="Arial" w:hAnsi="Arial" w:cs="Arial"/>
-        </w:rPr>
-        <w:t>=,</w:t>
-      </w:r>
-      <w:proofErr w:type="spellStart"/>
-      <w:r>
-        <w:rPr>
-          <w:rFonts w:ascii="Arial" w:hAnsi="Arial" w:cs="Arial"/>
-        </w:rPr>
-        <w:t>pmem</w:t>
-      </w:r>
-      <w:proofErr w:type="spellEnd"/>
-      <w:r>
-        <w:rPr>
-          <w:rFonts w:ascii="Arial" w:hAnsi="Arial" w:cs="Arial"/>
-        </w:rPr>
-        <w:t>=,</w:t>
-      </w:r>
-      <w:proofErr w:type="spellStart"/>
-      <w:r>
-        <w:rPr>
-          <w:rFonts w:ascii="Arial" w:hAnsi="Arial" w:cs="Arial"/>
-        </w:rPr>
-        <w:t>args</w:t>
-      </w:r>
-      <w:proofErr w:type="spellEnd"/>
-      <w:r>
-        <w:rPr>
-          <w:rFonts w:ascii="Arial" w:hAnsi="Arial" w:cs="Arial"/>
-        </w:rPr>
-        <w:t>=</w:t>
+      <w:r>
+        <w:rPr>
+          <w:rFonts w:ascii="Arial" w:hAnsi="Arial" w:cs="Arial"/>
+        </w:rPr>
+        <w:t xml:space="preserve"> --sort=-pcpu</w:t>
       </w:r>
       <w:r>
         <w:rPr>
@@ -151,43 +64,11 @@
         <w:rPr>
           <w:rFonts w:ascii="Arial" w:hAnsi="Arial" w:cs="Arial"/>
         </w:rPr>
-        <w:t xml:space="preserve"> --</w:t>
-      </w:r>
-      <w:proofErr w:type="gramEnd"/>
-      <w:r>
-        <w:rPr>
-          <w:rFonts w:ascii="Arial" w:hAnsi="Arial" w:cs="Arial"/>
-        </w:rPr>
-        <w:t>sort=-</w:t>
-      </w:r>
-      <w:proofErr w:type="spellStart"/>
-      <w:r>
-        <w:rPr>
-          <w:rFonts w:ascii="Arial" w:hAnsi="Arial" w:cs="Arial"/>
-        </w:rPr>
-        <w:t>pcpu</w:t>
-      </w:r>
-      <w:proofErr w:type="spellEnd"/>
-      <w:r>
-        <w:rPr>
-          <w:rFonts w:ascii="Arial" w:hAnsi="Arial" w:cs="Arial"/>
-        </w:rPr>
-        <w:t xml:space="preserve"> </w:t>
-      </w:r>
-      <w:r>
-        <w:rPr>
-          <w:rFonts w:ascii="Arial" w:hAnsi="Arial" w:cs="Arial"/>
-        </w:rPr>
         <w:t>| head -n 5</w:t>
       </w:r>
     </w:p>
     <w:p>
       <w:pPr>
-        <w:pStyle w:val="ListParagraph"/>
-        <w:numPr>
-          <w:ilvl w:val="0"/>
-          <w:numId w:val="1"/>
-        </w:numPr>
         <w:rPr>
           <w:rFonts w:ascii="Arial" w:hAnsi="Arial" w:cs="Arial"/>
         </w:rPr>
@@ -207,42 +88,12 @@
           <w:rFonts w:ascii="Arial" w:hAnsi="Arial" w:cs="Arial"/>
         </w:rPr>
       </w:pPr>
-      <w:proofErr w:type="spellStart"/>
-      <w:r>
-        <w:rPr>
-          <w:rFonts w:ascii="Arial" w:hAnsi="Arial" w:cs="Arial"/>
-        </w:rPr>
-        <w:t>ps</w:t>
-      </w:r>
-      <w:proofErr w:type="spellEnd"/>
-      <w:r>
-        <w:rPr>
-          <w:rFonts w:ascii="Arial" w:hAnsi="Arial" w:cs="Arial"/>
-        </w:rPr>
-        <w:t xml:space="preserve"> -</w:t>
-      </w:r>
-      <w:proofErr w:type="spellStart"/>
-      <w:r>
-        <w:rPr>
-          <w:rFonts w:ascii="Arial" w:hAnsi="Arial" w:cs="Arial"/>
-        </w:rPr>
-        <w:t>eo</w:t>
-      </w:r>
-      <w:proofErr w:type="spellEnd"/>
-      <w:r>
-        <w:rPr>
-          <w:rFonts w:ascii="Arial" w:hAnsi="Arial" w:cs="Arial"/>
-        </w:rPr>
-        <w:t xml:space="preserve"> </w:t>
-      </w:r>
-      <w:proofErr w:type="spellStart"/>
-      <w:r>
-        <w:rPr>
-          <w:rFonts w:ascii="Arial" w:hAnsi="Arial" w:cs="Arial"/>
-        </w:rPr>
-        <w:t>pcpu</w:t>
-      </w:r>
-      <w:proofErr w:type="spellEnd"/>
+      <w:r>
+        <w:rPr>
+          <w:rFonts w:ascii="Arial" w:hAnsi="Arial" w:cs="Arial"/>
+        </w:rPr>
+        <w:t>ps -eo pcpu</w:t>
+      </w:r>
       <w:r>
         <w:rPr>
           <w:rFonts w:ascii="Arial" w:hAnsi="Arial" w:cs="Arial"/>
@@ -253,16 +104,8 @@
         <w:rPr>
           <w:rFonts w:ascii="Arial" w:hAnsi="Arial" w:cs="Arial"/>
         </w:rPr>
-        <w:t>--sort=-</w:t>
-      </w:r>
-      <w:proofErr w:type="spellStart"/>
-      <w:r>
-        <w:rPr>
-          <w:rFonts w:ascii="Arial" w:hAnsi="Arial" w:cs="Arial"/>
-        </w:rPr>
-        <w:t>pcpu</w:t>
-      </w:r>
-      <w:proofErr w:type="spellEnd"/>
+        <w:t>--sort=-pcpu</w:t>
+      </w:r>
       <w:r>
         <w:rPr>
           <w:rFonts w:ascii="Arial" w:hAnsi="Arial" w:cs="Arial"/>
@@ -293,62 +136,18 @@
           <w:rFonts w:ascii="Arial" w:hAnsi="Arial" w:cs="Arial"/>
         </w:rPr>
       </w:pPr>
-      <w:proofErr w:type="spellStart"/>
-      <w:r>
-        <w:rPr>
-          <w:rFonts w:ascii="Arial" w:hAnsi="Arial" w:cs="Arial"/>
-        </w:rPr>
-        <w:t>top_cpu</w:t>
-      </w:r>
-      <w:proofErr w:type="spellEnd"/>
-      <w:r>
-        <w:rPr>
-          <w:rFonts w:ascii="Arial" w:hAnsi="Arial" w:cs="Arial"/>
-        </w:rPr>
-        <w:t>=</w:t>
-      </w:r>
-      <w:r>
-        <w:rPr>
-          <w:rFonts w:ascii="Arial" w:hAnsi="Arial" w:cs="Arial"/>
-        </w:rPr>
-        <w:t>$(</w:t>
-      </w:r>
-      <w:proofErr w:type="spellStart"/>
-      <w:r>
-        <w:rPr>
-          <w:rFonts w:ascii="Arial" w:hAnsi="Arial" w:cs="Arial"/>
-        </w:rPr>
-        <w:t>ps</w:t>
-      </w:r>
-      <w:proofErr w:type="spellEnd"/>
-      <w:r>
-        <w:rPr>
-          <w:rFonts w:ascii="Arial" w:hAnsi="Arial" w:cs="Arial"/>
-        </w:rPr>
-        <w:t xml:space="preserve"> -</w:t>
-      </w:r>
-      <w:proofErr w:type="spellStart"/>
-      <w:r>
-        <w:rPr>
-          <w:rFonts w:ascii="Arial" w:hAnsi="Arial" w:cs="Arial"/>
-        </w:rPr>
-        <w:t>eo</w:t>
-      </w:r>
-      <w:proofErr w:type="spellEnd"/>
-      <w:r>
-        <w:rPr>
-          <w:rFonts w:ascii="Arial" w:hAnsi="Arial" w:cs="Arial"/>
-        </w:rPr>
-        <w:t xml:space="preserve"> </w:t>
-      </w:r>
-      <w:proofErr w:type="spellStart"/>
-      <w:r>
-        <w:rPr>
-          <w:rFonts w:ascii="Arial" w:hAnsi="Arial" w:cs="Arial"/>
-        </w:rPr>
-        <w:t>pcpu</w:t>
-      </w:r>
-      <w:proofErr w:type="spellEnd"/>
+      <w:r>
+        <w:rPr>
+          <w:rFonts w:ascii="Arial" w:hAnsi="Arial" w:cs="Arial"/>
+        </w:rPr>
+        <w:t>top_cpu=$(</w:t>
+      </w:r>
+      <w:r>
+        <w:rPr>
+          <w:rFonts w:ascii="Arial" w:hAnsi="Arial" w:cs="Arial"/>
+        </w:rPr>
+        <w:t>ps -eo pcpu</w:t>
+      </w:r>
       <w:r>
         <w:rPr>
           <w:rFonts w:ascii="Arial" w:hAnsi="Arial" w:cs="Arial"/>
@@ -359,16 +158,8 @@
         <w:rPr>
           <w:rFonts w:ascii="Arial" w:hAnsi="Arial" w:cs="Arial"/>
         </w:rPr>
-        <w:t>--sort=-</w:t>
-      </w:r>
-      <w:proofErr w:type="spellStart"/>
-      <w:r>
-        <w:rPr>
-          <w:rFonts w:ascii="Arial" w:hAnsi="Arial" w:cs="Arial"/>
-        </w:rPr>
-        <w:t>pcpu</w:t>
-      </w:r>
-      <w:proofErr w:type="spellEnd"/>
+        <w:t>--sort=-pcpu</w:t>
+      </w:r>
       <w:r>
         <w:rPr>
           <w:rFonts w:ascii="Arial" w:hAnsi="Arial" w:cs="Arial"/>
@@ -438,19 +229,11 @@
         </w:rPr>
         <w:t>{</w:t>
       </w:r>
-      <w:proofErr w:type="spellStart"/>
-      <w:r>
-        <w:rPr>
-          <w:rFonts w:ascii="Arial" w:hAnsi="Arial" w:cs="Arial"/>
-        </w:rPr>
-        <w:t>printf</w:t>
-      </w:r>
-      <w:proofErr w:type="spellEnd"/>
-      <w:r>
-        <w:rPr>
-          <w:rFonts w:ascii="Arial" w:hAnsi="Arial" w:cs="Arial"/>
-        </w:rPr>
-        <w:t xml:space="preserve"> "%.1f", sum</w:t>
+      <w:r>
+        <w:rPr>
+          <w:rFonts w:ascii="Arial" w:hAnsi="Arial" w:cs="Arial"/>
+        </w:rPr>
+        <w:t>printf "%.1f", sum</w:t>
       </w:r>
       <w:r>
         <w:rPr>
@@ -474,14 +257,7 @@
         <w:rPr>
           <w:rFonts w:ascii="Arial" w:hAnsi="Arial" w:cs="Arial"/>
         </w:rPr>
-        <w:t>$</w:t>
-      </w:r>
-      <w:proofErr w:type="spellStart"/>
-      <w:r>
-        <w:rPr>
-          <w:rFonts w:ascii="Arial" w:hAnsi="Arial" w:cs="Arial"/>
-        </w:rPr>
-        <w:t>top_cp</w:t>
+        <w:t>$top_cp</w:t>
       </w:r>
       <w:r>
         <w:rPr>
@@ -489,7 +265,6 @@
         </w:rPr>
         <w:t>u</w:t>
       </w:r>
-      <w:proofErr w:type="spellEnd"/>
       <w:r>
         <w:rPr>
           <w:rFonts w:ascii="Arial" w:hAnsi="Arial" w:cs="Arial"/>
@@ -530,6 +305,797 @@
           <w:rFonts w:ascii="Arial" w:hAnsi="Arial" w:cs="Arial"/>
         </w:rPr>
       </w:pPr>
+      <w:r>
+        <w:rPr>
+          <w:rFonts w:ascii="Arial" w:hAnsi="Arial" w:cs="Arial"/>
+        </w:rPr>
+        <w:drawing>
+          <wp:inline distT="0" distB="0" distL="0" distR="0" wp14:anchorId="06A7DFED" wp14:editId="7B05363E">
+            <wp:extent cx="5731510" cy="1989455"/>
+            <wp:effectExtent l="0" t="0" r="2540" b="0"/>
+            <wp:docPr id="837987958" name="Picture 1"/>
+            <wp:cNvGraphicFramePr>
+              <a:graphicFrameLocks xmlns:a="http://schemas.openxmlformats.org/drawingml/2006/main" noChangeAspect="1"/>
+            </wp:cNvGraphicFramePr>
+            <a:graphic xmlns:a="http://schemas.openxmlformats.org/drawingml/2006/main">
+              <a:graphicData uri="http://schemas.openxmlformats.org/drawingml/2006/picture">
+                <pic:pic xmlns:pic="http://schemas.openxmlformats.org/drawingml/2006/picture">
+                  <pic:nvPicPr>
+                    <pic:cNvPr id="837987958" name=""/>
+                    <pic:cNvPicPr/>
+                  </pic:nvPicPr>
+                  <pic:blipFill>
+                    <a:blip r:embed="rId5"/>
+                    <a:stretch>
+                      <a:fillRect/>
+                    </a:stretch>
+                  </pic:blipFill>
+                  <pic:spPr>
+                    <a:xfrm>
+                      <a:off x="0" y="0"/>
+                      <a:ext cx="5731510" cy="1989455"/>
+                    </a:xfrm>
+                    <a:prstGeom prst="rect">
+                      <a:avLst/>
+                    </a:prstGeom>
+                  </pic:spPr>
+                </pic:pic>
+              </a:graphicData>
+            </a:graphic>
+          </wp:inline>
+        </w:drawing>
+      </w:r>
+    </w:p>
+    <w:p>
+      <w:pPr>
+        <w:rPr>
+          <w:rFonts w:ascii="Arial" w:hAnsi="Arial" w:cs="Arial"/>
+        </w:rPr>
+      </w:pPr>
+      <w:r>
+        <w:rPr>
+          <w:rFonts w:ascii="Arial" w:hAnsi="Arial" w:cs="Arial"/>
+        </w:rPr>
+        <w:t>This is my test file to play around with awk more. ^^</w:t>
+      </w:r>
+    </w:p>
+    <w:p>
+      <w:pPr>
+        <w:rPr>
+          <w:rFonts w:ascii="Arial" w:hAnsi="Arial" w:cs="Arial"/>
+        </w:rPr>
+      </w:pPr>
+      <w:r>
+        <w:rPr>
+          <w:rFonts w:ascii="Arial" w:hAnsi="Arial" w:cs="Arial"/>
+          <w:noProof/>
+        </w:rPr>
+        <w:drawing>
+          <wp:inline distT="0" distB="0" distL="0" distR="0" wp14:anchorId="75C66246" wp14:editId="286CB700">
+            <wp:extent cx="5731510" cy="1974850"/>
+            <wp:effectExtent l="0" t="0" r="2540" b="6350"/>
+            <wp:docPr id="1313283716" name="Picture 1"/>
+            <wp:cNvGraphicFramePr>
+              <a:graphicFrameLocks xmlns:a="http://schemas.openxmlformats.org/drawingml/2006/main" noChangeAspect="1"/>
+            </wp:cNvGraphicFramePr>
+            <a:graphic xmlns:a="http://schemas.openxmlformats.org/drawingml/2006/main">
+              <a:graphicData uri="http://schemas.openxmlformats.org/drawingml/2006/picture">
+                <pic:pic xmlns:pic="http://schemas.openxmlformats.org/drawingml/2006/picture">
+                  <pic:nvPicPr>
+                    <pic:cNvPr id="1313283716" name=""/>
+                    <pic:cNvPicPr/>
+                  </pic:nvPicPr>
+                  <pic:blipFill>
+                    <a:blip r:embed="rId6"/>
+                    <a:stretch>
+                      <a:fillRect/>
+                    </a:stretch>
+                  </pic:blipFill>
+                  <pic:spPr>
+                    <a:xfrm>
+                      <a:off x="0" y="0"/>
+                      <a:ext cx="5731510" cy="1974850"/>
+                    </a:xfrm>
+                    <a:prstGeom prst="rect">
+                      <a:avLst/>
+                    </a:prstGeom>
+                  </pic:spPr>
+                </pic:pic>
+              </a:graphicData>
+            </a:graphic>
+          </wp:inline>
+        </w:drawing>
+      </w:r>
+    </w:p>
+    <w:p>
+      <w:pPr>
+        <w:rPr>
+          <w:rFonts w:ascii="Arial" w:hAnsi="Arial" w:cs="Arial"/>
+        </w:rPr>
+      </w:pPr>
+      <w:r>
+        <w:rPr>
+          <w:rFonts w:ascii="Arial" w:hAnsi="Arial" w:cs="Arial"/>
+        </w:rPr>
+        <w:t>Processes are reading as 0 cpu usage currently. Not sure why that’s happening.</w:t>
+      </w:r>
+    </w:p>
+    <w:p>
+      <w:pPr>
+        <w:rPr>
+          <w:rFonts w:ascii="Arial" w:hAnsi="Arial" w:cs="Arial"/>
+        </w:rPr>
+      </w:pPr>
+      <w:r>
+        <w:rPr>
+          <w:rFonts w:ascii="Arial" w:hAnsi="Arial" w:cs="Arial"/>
+          <w:noProof/>
+        </w:rPr>
+        <w:lastRenderedPageBreak/>
+        <w:drawing>
+          <wp:inline distT="0" distB="0" distL="0" distR="0" wp14:anchorId="1BF30526" wp14:editId="462F8446">
+            <wp:extent cx="5731510" cy="2512060"/>
+            <wp:effectExtent l="0" t="0" r="2540" b="2540"/>
+            <wp:docPr id="44375162" name="Picture 1"/>
+            <wp:cNvGraphicFramePr>
+              <a:graphicFrameLocks xmlns:a="http://schemas.openxmlformats.org/drawingml/2006/main" noChangeAspect="1"/>
+            </wp:cNvGraphicFramePr>
+            <a:graphic xmlns:a="http://schemas.openxmlformats.org/drawingml/2006/main">
+              <a:graphicData uri="http://schemas.openxmlformats.org/drawingml/2006/picture">
+                <pic:pic xmlns:pic="http://schemas.openxmlformats.org/drawingml/2006/picture">
+                  <pic:nvPicPr>
+                    <pic:cNvPr id="44375162" name=""/>
+                    <pic:cNvPicPr/>
+                  </pic:nvPicPr>
+                  <pic:blipFill>
+                    <a:blip r:embed="rId7"/>
+                    <a:stretch>
+                      <a:fillRect/>
+                    </a:stretch>
+                  </pic:blipFill>
+                  <pic:spPr>
+                    <a:xfrm>
+                      <a:off x="0" y="0"/>
+                      <a:ext cx="5731510" cy="2512060"/>
+                    </a:xfrm>
+                    <a:prstGeom prst="rect">
+                      <a:avLst/>
+                    </a:prstGeom>
+                  </pic:spPr>
+                </pic:pic>
+              </a:graphicData>
+            </a:graphic>
+          </wp:inline>
+        </w:drawing>
+      </w:r>
+    </w:p>
+    <w:p>
+      <w:pPr>
+        <w:rPr>
+          <w:rFonts w:ascii="Arial" w:hAnsi="Arial" w:cs="Arial"/>
+        </w:rPr>
+      </w:pPr>
+      <w:r>
+        <w:rPr>
+          <w:rFonts w:ascii="Arial" w:hAnsi="Arial" w:cs="Arial"/>
+        </w:rPr>
+        <w:t>The check to see if the user wants to close the highest cpu-using programs.</w:t>
+      </w:r>
+    </w:p>
+    <w:p>
+      <w:pPr>
+        <w:rPr>
+          <w:rFonts w:ascii="Arial" w:hAnsi="Arial" w:cs="Arial"/>
+        </w:rPr>
+      </w:pPr>
+      <w:r>
+        <w:rPr>
+          <w:rFonts w:ascii="Arial" w:hAnsi="Arial" w:cs="Arial"/>
+          <w:noProof/>
+        </w:rPr>
+        <w:drawing>
+          <wp:inline distT="0" distB="0" distL="0" distR="0" wp14:anchorId="76559936" wp14:editId="70860D44">
+            <wp:extent cx="5731510" cy="1234440"/>
+            <wp:effectExtent l="0" t="0" r="2540" b="3810"/>
+            <wp:docPr id="504479258" name="Picture 1"/>
+            <wp:cNvGraphicFramePr>
+              <a:graphicFrameLocks xmlns:a="http://schemas.openxmlformats.org/drawingml/2006/main" noChangeAspect="1"/>
+            </wp:cNvGraphicFramePr>
+            <a:graphic xmlns:a="http://schemas.openxmlformats.org/drawingml/2006/main">
+              <a:graphicData uri="http://schemas.openxmlformats.org/drawingml/2006/picture">
+                <pic:pic xmlns:pic="http://schemas.openxmlformats.org/drawingml/2006/picture">
+                  <pic:nvPicPr>
+                    <pic:cNvPr id="504479258" name=""/>
+                    <pic:cNvPicPr/>
+                  </pic:nvPicPr>
+                  <pic:blipFill>
+                    <a:blip r:embed="rId8"/>
+                    <a:stretch>
+                      <a:fillRect/>
+                    </a:stretch>
+                  </pic:blipFill>
+                  <pic:spPr>
+                    <a:xfrm>
+                      <a:off x="0" y="0"/>
+                      <a:ext cx="5731510" cy="1234440"/>
+                    </a:xfrm>
+                    <a:prstGeom prst="rect">
+                      <a:avLst/>
+                    </a:prstGeom>
+                  </pic:spPr>
+                </pic:pic>
+              </a:graphicData>
+            </a:graphic>
+          </wp:inline>
+        </w:drawing>
+      </w:r>
+    </w:p>
+    <w:p>
+      <w:pPr>
+        <w:rPr>
+          <w:rFonts w:ascii="Arial" w:hAnsi="Arial" w:cs="Arial"/>
+        </w:rPr>
+      </w:pPr>
+      <w:r>
+        <w:rPr>
+          <w:rFonts w:ascii="Arial" w:hAnsi="Arial" w:cs="Arial"/>
+          <w:noProof/>
+        </w:rPr>
+        <w:drawing>
+          <wp:inline distT="0" distB="0" distL="0" distR="0" wp14:anchorId="30B071D8" wp14:editId="7C0C3D23">
+            <wp:extent cx="4610743" cy="1371791"/>
+            <wp:effectExtent l="0" t="0" r="0" b="0"/>
+            <wp:docPr id="1346966509" name="Picture 1"/>
+            <wp:cNvGraphicFramePr>
+              <a:graphicFrameLocks xmlns:a="http://schemas.openxmlformats.org/drawingml/2006/main" noChangeAspect="1"/>
+            </wp:cNvGraphicFramePr>
+            <a:graphic xmlns:a="http://schemas.openxmlformats.org/drawingml/2006/main">
+              <a:graphicData uri="http://schemas.openxmlformats.org/drawingml/2006/picture">
+                <pic:pic xmlns:pic="http://schemas.openxmlformats.org/drawingml/2006/picture">
+                  <pic:nvPicPr>
+                    <pic:cNvPr id="1346966509" name=""/>
+                    <pic:cNvPicPr/>
+                  </pic:nvPicPr>
+                  <pic:blipFill>
+                    <a:blip r:embed="rId9"/>
+                    <a:stretch>
+                      <a:fillRect/>
+                    </a:stretch>
+                  </pic:blipFill>
+                  <pic:spPr>
+                    <a:xfrm>
+                      <a:off x="0" y="0"/>
+                      <a:ext cx="4610743" cy="1371791"/>
+                    </a:xfrm>
+                    <a:prstGeom prst="rect">
+                      <a:avLst/>
+                    </a:prstGeom>
+                  </pic:spPr>
+                </pic:pic>
+              </a:graphicData>
+            </a:graphic>
+          </wp:inline>
+        </w:drawing>
+      </w:r>
+    </w:p>
+    <w:p>
+      <w:pPr>
+        <w:rPr>
+          <w:rFonts w:ascii="Arial" w:hAnsi="Arial" w:cs="Arial"/>
+        </w:rPr>
+      </w:pPr>
+      <w:r>
+        <w:rPr>
+          <w:rFonts w:ascii="Arial" w:hAnsi="Arial" w:cs="Arial"/>
+        </w:rPr>
+        <w:t>Was unsure whether to group the min cpu and min ram together but I figured the distinction between sections was appropriate.</w:t>
+      </w:r>
+    </w:p>
+    <w:p>
+      <w:pPr>
+        <w:rPr>
+          <w:rFonts w:ascii="Arial" w:hAnsi="Arial" w:cs="Arial"/>
+        </w:rPr>
+      </w:pPr>
+      <w:r>
+        <w:rPr>
+          <w:rFonts w:ascii="Arial" w:hAnsi="Arial" w:cs="Arial"/>
+          <w:noProof/>
+        </w:rPr>
+        <w:drawing>
+          <wp:inline distT="0" distB="0" distL="0" distR="0" wp14:anchorId="363A849B" wp14:editId="7DFDF33D">
+            <wp:extent cx="3962953" cy="1190791"/>
+            <wp:effectExtent l="0" t="0" r="0" b="9525"/>
+            <wp:docPr id="2080673209" name="Picture 1"/>
+            <wp:cNvGraphicFramePr>
+              <a:graphicFrameLocks xmlns:a="http://schemas.openxmlformats.org/drawingml/2006/main" noChangeAspect="1"/>
+            </wp:cNvGraphicFramePr>
+            <a:graphic xmlns:a="http://schemas.openxmlformats.org/drawingml/2006/main">
+              <a:graphicData uri="http://schemas.openxmlformats.org/drawingml/2006/picture">
+                <pic:pic xmlns:pic="http://schemas.openxmlformats.org/drawingml/2006/picture">
+                  <pic:nvPicPr>
+                    <pic:cNvPr id="2080673209" name=""/>
+                    <pic:cNvPicPr/>
+                  </pic:nvPicPr>
+                  <pic:blipFill>
+                    <a:blip r:embed="rId10"/>
+                    <a:stretch>
+                      <a:fillRect/>
+                    </a:stretch>
+                  </pic:blipFill>
+                  <pic:spPr>
+                    <a:xfrm>
+                      <a:off x="0" y="0"/>
+                      <a:ext cx="3962953" cy="1190791"/>
+                    </a:xfrm>
+                    <a:prstGeom prst="rect">
+                      <a:avLst/>
+                    </a:prstGeom>
+                  </pic:spPr>
+                </pic:pic>
+              </a:graphicData>
+            </a:graphic>
+          </wp:inline>
+        </w:drawing>
+      </w:r>
+    </w:p>
+    <w:p>
+      <w:pPr>
+        <w:rPr>
+          <w:rFonts w:ascii="Arial" w:hAnsi="Arial" w:cs="Arial"/>
+        </w:rPr>
+      </w:pPr>
+      <w:r>
+        <w:rPr>
+          <w:rFonts w:ascii="Arial" w:hAnsi="Arial" w:cs="Arial"/>
+        </w:rPr>
+        <w:t>I’ve excluded the 5 limit due to the need to count all ram for the total this time.</w:t>
+      </w:r>
+    </w:p>
+    <w:p>
+      <w:pPr>
+        <w:rPr>
+          <w:rFonts w:ascii="Arial" w:hAnsi="Arial" w:cs="Arial"/>
+        </w:rPr>
+      </w:pPr>
+      <w:r>
+        <w:rPr>
+          <w:rFonts w:ascii="Arial" w:hAnsi="Arial" w:cs="Arial"/>
+          <w:noProof/>
+        </w:rPr>
+        <w:lastRenderedPageBreak/>
+        <w:drawing>
+          <wp:inline distT="0" distB="0" distL="0" distR="0" wp14:anchorId="05B2B430" wp14:editId="7A07FF7A">
+            <wp:extent cx="5731510" cy="2431415"/>
+            <wp:effectExtent l="0" t="0" r="2540" b="6985"/>
+            <wp:docPr id="1632407243" name="Picture 1"/>
+            <wp:cNvGraphicFramePr>
+              <a:graphicFrameLocks xmlns:a="http://schemas.openxmlformats.org/drawingml/2006/main" noChangeAspect="1"/>
+            </wp:cNvGraphicFramePr>
+            <a:graphic xmlns:a="http://schemas.openxmlformats.org/drawingml/2006/main">
+              <a:graphicData uri="http://schemas.openxmlformats.org/drawingml/2006/picture">
+                <pic:pic xmlns:pic="http://schemas.openxmlformats.org/drawingml/2006/picture">
+                  <pic:nvPicPr>
+                    <pic:cNvPr id="1632407243" name=""/>
+                    <pic:cNvPicPr/>
+                  </pic:nvPicPr>
+                  <pic:blipFill>
+                    <a:blip r:embed="rId11"/>
+                    <a:stretch>
+                      <a:fillRect/>
+                    </a:stretch>
+                  </pic:blipFill>
+                  <pic:spPr>
+                    <a:xfrm>
+                      <a:off x="0" y="0"/>
+                      <a:ext cx="5731510" cy="2431415"/>
+                    </a:xfrm>
+                    <a:prstGeom prst="rect">
+                      <a:avLst/>
+                    </a:prstGeom>
+                  </pic:spPr>
+                </pic:pic>
+              </a:graphicData>
+            </a:graphic>
+          </wp:inline>
+        </w:drawing>
+      </w:r>
+    </w:p>
+    <w:p>
+      <w:pPr>
+        <w:rPr>
+          <w:rFonts w:ascii="Arial" w:hAnsi="Arial" w:cs="Arial"/>
+        </w:rPr>
+      </w:pPr>
+      <w:r>
+        <w:rPr>
+          <w:rFonts w:ascii="Arial" w:hAnsi="Arial" w:cs="Arial"/>
+        </w:rPr>
+        <w:t xml:space="preserve">Instead, I put it at the end of the loop to group it simply for that purpose. </w:t>
+      </w:r>
+    </w:p>
+    <w:p>
+      <w:pPr>
+        <w:rPr>
+          <w:rFonts w:ascii="Arial" w:hAnsi="Arial" w:cs="Arial"/>
+        </w:rPr>
+      </w:pPr>
+      <w:r>
+        <w:rPr>
+          <w:rFonts w:ascii="Arial" w:hAnsi="Arial" w:cs="Arial"/>
+          <w:noProof/>
+        </w:rPr>
+        <w:drawing>
+          <wp:inline distT="0" distB="0" distL="0" distR="0" wp14:anchorId="7755B70C" wp14:editId="0401C512">
+            <wp:extent cx="5731510" cy="1125220"/>
+            <wp:effectExtent l="0" t="0" r="2540" b="0"/>
+            <wp:docPr id="1218082625" name="Picture 1"/>
+            <wp:cNvGraphicFramePr>
+              <a:graphicFrameLocks xmlns:a="http://schemas.openxmlformats.org/drawingml/2006/main" noChangeAspect="1"/>
+            </wp:cNvGraphicFramePr>
+            <a:graphic xmlns:a="http://schemas.openxmlformats.org/drawingml/2006/main">
+              <a:graphicData uri="http://schemas.openxmlformats.org/drawingml/2006/picture">
+                <pic:pic xmlns:pic="http://schemas.openxmlformats.org/drawingml/2006/picture">
+                  <pic:nvPicPr>
+                    <pic:cNvPr id="1218082625" name=""/>
+                    <pic:cNvPicPr/>
+                  </pic:nvPicPr>
+                  <pic:blipFill>
+                    <a:blip r:embed="rId12"/>
+                    <a:stretch>
+                      <a:fillRect/>
+                    </a:stretch>
+                  </pic:blipFill>
+                  <pic:spPr>
+                    <a:xfrm>
+                      <a:off x="0" y="0"/>
+                      <a:ext cx="5731510" cy="1125220"/>
+                    </a:xfrm>
+                    <a:prstGeom prst="rect">
+                      <a:avLst/>
+                    </a:prstGeom>
+                  </pic:spPr>
+                </pic:pic>
+              </a:graphicData>
+            </a:graphic>
+          </wp:inline>
+        </w:drawing>
+      </w:r>
+    </w:p>
+    <w:p>
+      <w:pPr>
+        <w:rPr>
+          <w:rFonts w:ascii="Arial" w:hAnsi="Arial" w:cs="Arial"/>
+        </w:rPr>
+      </w:pPr>
+      <w:r>
+        <w:rPr>
+          <w:rFonts w:ascii="Arial" w:hAnsi="Arial" w:cs="Arial"/>
+        </w:rPr>
+        <w:t xml:space="preserve">Getting values above 100% for the ram but I think that’s because it’s counting some processes twice. Unsure what it’s counting but I’ll look into it later. </w:t>
+      </w:r>
+    </w:p>
+    <w:p>
+      <w:pPr>
+        <w:rPr>
+          <w:rFonts w:ascii="Arial" w:hAnsi="Arial" w:cs="Arial"/>
+        </w:rPr>
+      </w:pPr>
+      <w:r>
+        <w:rPr>
+          <w:rFonts w:ascii="Arial" w:hAnsi="Arial" w:cs="Arial"/>
+          <w:noProof/>
+        </w:rPr>
+        <w:lastRenderedPageBreak/>
+        <w:drawing>
+          <wp:inline distT="0" distB="0" distL="0" distR="0" wp14:anchorId="57EFEA8C" wp14:editId="7FD55FE6">
+            <wp:extent cx="5731510" cy="5195570"/>
+            <wp:effectExtent l="0" t="0" r="2540" b="5080"/>
+            <wp:docPr id="2145879550" name="Picture 1"/>
+            <wp:cNvGraphicFramePr>
+              <a:graphicFrameLocks xmlns:a="http://schemas.openxmlformats.org/drawingml/2006/main" noChangeAspect="1"/>
+            </wp:cNvGraphicFramePr>
+            <a:graphic xmlns:a="http://schemas.openxmlformats.org/drawingml/2006/main">
+              <a:graphicData uri="http://schemas.openxmlformats.org/drawingml/2006/picture">
+                <pic:pic xmlns:pic="http://schemas.openxmlformats.org/drawingml/2006/picture">
+                  <pic:nvPicPr>
+                    <pic:cNvPr id="2145879550" name=""/>
+                    <pic:cNvPicPr/>
+                  </pic:nvPicPr>
+                  <pic:blipFill>
+                    <a:blip r:embed="rId13"/>
+                    <a:stretch>
+                      <a:fillRect/>
+                    </a:stretch>
+                  </pic:blipFill>
+                  <pic:spPr>
+                    <a:xfrm>
+                      <a:off x="0" y="0"/>
+                      <a:ext cx="5731510" cy="5195570"/>
+                    </a:xfrm>
+                    <a:prstGeom prst="rect">
+                      <a:avLst/>
+                    </a:prstGeom>
+                  </pic:spPr>
+                </pic:pic>
+              </a:graphicData>
+            </a:graphic>
+          </wp:inline>
+        </w:drawing>
+      </w:r>
+    </w:p>
+    <w:p>
+      <w:pPr>
+        <w:rPr>
+          <w:rFonts w:ascii="Arial" w:hAnsi="Arial" w:cs="Arial"/>
+        </w:rPr>
+      </w:pPr>
+      <w:r>
+        <w:rPr>
+          <w:rFonts w:ascii="Arial" w:hAnsi="Arial" w:cs="Arial"/>
+        </w:rPr>
+        <w:t xml:space="preserve">Going to loop over the menu so it’s a conscious decision to exit the program. Using an integer because I think changing Booleans mid-program is difficult in bash. </w:t>
+      </w:r>
+    </w:p>
+    <w:p>
+      <w:pPr>
+        <w:rPr>
+          <w:rFonts w:ascii="Arial" w:hAnsi="Arial" w:cs="Arial"/>
+        </w:rPr>
+      </w:pPr>
+      <w:r>
+        <w:rPr>
+          <w:rFonts w:ascii="Arial" w:hAnsi="Arial" w:cs="Arial"/>
+          <w:noProof/>
+        </w:rPr>
+        <w:drawing>
+          <wp:inline distT="0" distB="0" distL="0" distR="0" wp14:anchorId="77C1F35F" wp14:editId="6AC0F928">
+            <wp:extent cx="5731510" cy="2421890"/>
+            <wp:effectExtent l="0" t="0" r="2540" b="0"/>
+            <wp:docPr id="503223985" name="Picture 1"/>
+            <wp:cNvGraphicFramePr>
+              <a:graphicFrameLocks xmlns:a="http://schemas.openxmlformats.org/drawingml/2006/main" noChangeAspect="1"/>
+            </wp:cNvGraphicFramePr>
+            <a:graphic xmlns:a="http://schemas.openxmlformats.org/drawingml/2006/main">
+              <a:graphicData uri="http://schemas.openxmlformats.org/drawingml/2006/picture">
+                <pic:pic xmlns:pic="http://schemas.openxmlformats.org/drawingml/2006/picture">
+                  <pic:nvPicPr>
+                    <pic:cNvPr id="503223985" name=""/>
+                    <pic:cNvPicPr/>
+                  </pic:nvPicPr>
+                  <pic:blipFill>
+                    <a:blip r:embed="rId14"/>
+                    <a:stretch>
+                      <a:fillRect/>
+                    </a:stretch>
+                  </pic:blipFill>
+                  <pic:spPr>
+                    <a:xfrm>
+                      <a:off x="0" y="0"/>
+                      <a:ext cx="5731510" cy="2421890"/>
+                    </a:xfrm>
+                    <a:prstGeom prst="rect">
+                      <a:avLst/>
+                    </a:prstGeom>
+                  </pic:spPr>
+                </pic:pic>
+              </a:graphicData>
+            </a:graphic>
+          </wp:inline>
+        </w:drawing>
+      </w:r>
+    </w:p>
+    <w:p>
+      <w:pPr>
+        <w:rPr>
+          <w:rFonts w:ascii="Arial" w:hAnsi="Arial" w:cs="Arial"/>
+        </w:rPr>
+      </w:pPr>
+      <w:r>
+        <w:rPr>
+          <w:rFonts w:ascii="Arial" w:hAnsi="Arial" w:cs="Arial"/>
+        </w:rPr>
+        <w:t>Simply copied the remove function from earlier and pasted it in the ‘t’ action.</w:t>
+      </w:r>
+    </w:p>
+    <w:p>
+      <w:pPr>
+        <w:rPr>
+          <w:rFonts w:ascii="Arial" w:hAnsi="Arial" w:cs="Arial"/>
+        </w:rPr>
+      </w:pPr>
+      <w:r>
+        <w:rPr>
+          <w:rFonts w:ascii="Arial" w:hAnsi="Arial" w:cs="Arial"/>
+          <w:noProof/>
+        </w:rPr>
+        <w:lastRenderedPageBreak/>
+        <w:drawing>
+          <wp:inline distT="0" distB="0" distL="0" distR="0" wp14:anchorId="2097E9E8" wp14:editId="781C629C">
+            <wp:extent cx="5731510" cy="3569970"/>
+            <wp:effectExtent l="0" t="0" r="2540" b="0"/>
+            <wp:docPr id="74500600" name="Picture 1"/>
+            <wp:cNvGraphicFramePr>
+              <a:graphicFrameLocks xmlns:a="http://schemas.openxmlformats.org/drawingml/2006/main" noChangeAspect="1"/>
+            </wp:cNvGraphicFramePr>
+            <a:graphic xmlns:a="http://schemas.openxmlformats.org/drawingml/2006/main">
+              <a:graphicData uri="http://schemas.openxmlformats.org/drawingml/2006/picture">
+                <pic:pic xmlns:pic="http://schemas.openxmlformats.org/drawingml/2006/picture">
+                  <pic:nvPicPr>
+                    <pic:cNvPr id="74500600" name=""/>
+                    <pic:cNvPicPr/>
+                  </pic:nvPicPr>
+                  <pic:blipFill>
+                    <a:blip r:embed="rId15"/>
+                    <a:stretch>
+                      <a:fillRect/>
+                    </a:stretch>
+                  </pic:blipFill>
+                  <pic:spPr>
+                    <a:xfrm>
+                      <a:off x="0" y="0"/>
+                      <a:ext cx="5731510" cy="3569970"/>
+                    </a:xfrm>
+                    <a:prstGeom prst="rect">
+                      <a:avLst/>
+                    </a:prstGeom>
+                  </pic:spPr>
+                </pic:pic>
+              </a:graphicData>
+            </a:graphic>
+          </wp:inline>
+        </w:drawing>
+      </w:r>
+    </w:p>
+    <w:p>
+      <w:pPr>
+        <w:rPr>
+          <w:rFonts w:ascii="Arial" w:hAnsi="Arial" w:cs="Arial"/>
+        </w:rPr>
+      </w:pPr>
+      <w:r>
+        <w:rPr>
+          <w:rFonts w:ascii="Arial" w:hAnsi="Arial" w:cs="Arial"/>
+        </w:rPr>
+        <w:t>Looping over the nice value to make sure this exit is also conscious and the user doesn’t have to keep entering the same pid because they don’t correctly enter a nice value.</w:t>
+      </w:r>
+    </w:p>
+    <w:p>
+      <w:pPr>
+        <w:rPr>
+          <w:rFonts w:ascii="Arial" w:hAnsi="Arial" w:cs="Arial"/>
+        </w:rPr>
+      </w:pPr>
+      <w:r>
+        <w:rPr>
+          <w:rFonts w:ascii="Arial" w:hAnsi="Arial" w:cs="Arial"/>
+          <w:noProof/>
+        </w:rPr>
+        <w:lastRenderedPageBreak/>
+        <w:drawing>
+          <wp:inline distT="0" distB="0" distL="0" distR="0" wp14:anchorId="639926FB" wp14:editId="3FA5AAB5">
+            <wp:extent cx="5731510" cy="5139055"/>
+            <wp:effectExtent l="0" t="0" r="2540" b="4445"/>
+            <wp:docPr id="198458556" name="Picture 1"/>
+            <wp:cNvGraphicFramePr>
+              <a:graphicFrameLocks xmlns:a="http://schemas.openxmlformats.org/drawingml/2006/main" noChangeAspect="1"/>
+            </wp:cNvGraphicFramePr>
+            <a:graphic xmlns:a="http://schemas.openxmlformats.org/drawingml/2006/main">
+              <a:graphicData uri="http://schemas.openxmlformats.org/drawingml/2006/picture">
+                <pic:pic xmlns:pic="http://schemas.openxmlformats.org/drawingml/2006/picture">
+                  <pic:nvPicPr>
+                    <pic:cNvPr id="198458556" name=""/>
+                    <pic:cNvPicPr/>
+                  </pic:nvPicPr>
+                  <pic:blipFill>
+                    <a:blip r:embed="rId16"/>
+                    <a:stretch>
+                      <a:fillRect/>
+                    </a:stretch>
+                  </pic:blipFill>
+                  <pic:spPr>
+                    <a:xfrm>
+                      <a:off x="0" y="0"/>
+                      <a:ext cx="5731510" cy="5139055"/>
+                    </a:xfrm>
+                    <a:prstGeom prst="rect">
+                      <a:avLst/>
+                    </a:prstGeom>
+                  </pic:spPr>
+                </pic:pic>
+              </a:graphicData>
+            </a:graphic>
+          </wp:inline>
+        </w:drawing>
+      </w:r>
+    </w:p>
+    <w:p>
+      <w:pPr>
+        <w:rPr>
+          <w:rFonts w:ascii="Arial" w:hAnsi="Arial" w:cs="Arial"/>
+        </w:rPr>
+      </w:pPr>
+      <w:r>
+        <w:rPr>
+          <w:rFonts w:ascii="Arial" w:hAnsi="Arial" w:cs="Arial"/>
+        </w:rPr>
+        <w:t>The memory logs from my testing.</w:t>
+      </w:r>
+    </w:p>
+    <w:p>
+      <w:pPr>
+        <w:rPr>
+          <w:rFonts w:ascii="Arial" w:hAnsi="Arial" w:cs="Arial"/>
+        </w:rPr>
+      </w:pPr>
+      <w:r>
+        <w:rPr>
+          <w:rFonts w:ascii="Arial" w:hAnsi="Arial" w:cs="Arial"/>
+        </w:rPr>
+        <w:t>Extras::</w:t>
+      </w:r>
+    </w:p>
+    <w:p>
+      <w:pPr>
+        <w:rPr>
+          <w:rFonts w:ascii="Arial" w:hAnsi="Arial" w:cs="Arial"/>
+        </w:rPr>
+      </w:pPr>
+      <w:r>
+        <w:rPr>
+          <w:rFonts w:ascii="Arial" w:hAnsi="Arial" w:cs="Arial"/>
+          <w:noProof/>
+        </w:rPr>
+        <w:lastRenderedPageBreak/>
+        <w:drawing>
+          <wp:inline distT="0" distB="0" distL="0" distR="0" wp14:anchorId="528463EB" wp14:editId="0EFC9167">
+            <wp:extent cx="5731510" cy="4785360"/>
+            <wp:effectExtent l="0" t="0" r="2540" b="0"/>
+            <wp:docPr id="1487749827" name="Picture 1"/>
+            <wp:cNvGraphicFramePr>
+              <a:graphicFrameLocks xmlns:a="http://schemas.openxmlformats.org/drawingml/2006/main" noChangeAspect="1"/>
+            </wp:cNvGraphicFramePr>
+            <a:graphic xmlns:a="http://schemas.openxmlformats.org/drawingml/2006/main">
+              <a:graphicData uri="http://schemas.openxmlformats.org/drawingml/2006/picture">
+                <pic:pic xmlns:pic="http://schemas.openxmlformats.org/drawingml/2006/picture">
+                  <pic:nvPicPr>
+                    <pic:cNvPr id="1487749827" name=""/>
+                    <pic:cNvPicPr/>
+                  </pic:nvPicPr>
+                  <pic:blipFill>
+                    <a:blip r:embed="rId17"/>
+                    <a:stretch>
+                      <a:fillRect/>
+                    </a:stretch>
+                  </pic:blipFill>
+                  <pic:spPr>
+                    <a:xfrm>
+                      <a:off x="0" y="0"/>
+                      <a:ext cx="5731510" cy="4785360"/>
+                    </a:xfrm>
+                    <a:prstGeom prst="rect">
+                      <a:avLst/>
+                    </a:prstGeom>
+                  </pic:spPr>
+                </pic:pic>
+              </a:graphicData>
+            </a:graphic>
+          </wp:inline>
+        </w:drawing>
+      </w:r>
+    </w:p>
+    <w:p>
+      <w:pPr>
+        <w:rPr>
+          <w:rFonts w:ascii="Arial" w:hAnsi="Arial" w:cs="Arial"/>
+        </w:rPr>
+      </w:pPr>
+      <w:r>
+        <w:rPr>
+          <w:rFonts w:ascii="Arial" w:hAnsi="Arial" w:cs="Arial"/>
+        </w:rPr>
+        <w:t>Line to break up and make the outputs easier to read. End to close the program with certain errors and again – readability. Log to output errors to a log file if ram is above expected amount.</w:t>
+      </w:r>
     </w:p>
     <w:sectPr>
       <w:pgSz w:w="11906" w:h="16838"/>
@@ -542,7 +1108,7 @@
 </file>
 
 <file path=word/numbering.xml><?xml version="1.0" encoding="utf-8"?>
-<w:numbering xmlns:wpc="http://schemas.microsoft.com/office/word/2010/wordprocessingCanvas" xmlns:cx="http://schemas.microsoft.com/office/drawing/2014/chartex" xmlns:cx1="http://schemas.microsoft.com/office/drawing/2015/9/8/chartex" xmlns:cx2="http://schemas.microsoft.com/office/drawing/2015/10/21/chartex" xmlns:cx3="http://schemas.microsoft.com/office/drawing/2016/5/9/chartex" xmlns:cx4="http://schemas.microsoft.com/office/drawing/2016/5/10/chartex" xmlns:cx5="http://schemas.microsoft.com/office/drawing/2016/5/11/chartex" xmlns:cx6="http://schemas.microsoft.com/office/drawing/2016/5/12/chartex" xmlns:cx7="http://schemas.microsoft.com/office/drawing/2016/5/13/chartex" xmlns:cx8="http://schemas.microsoft.com/office/drawing/2016/5/14/chartex" xmlns:mc="http://schemas.openxmlformats.org/markup-compatibility/2006" xmlns:aink="http://schemas.microsoft.com/office/drawing/2016/ink" xmlns:am3d="http://schemas.microsoft.com/office/drawing/2017/model3d" xmlns:o="urn:schemas-microsoft-com:office:office" xmlns:oel="http://schemas.microsoft.com/office/2019/extlst" xmlns:r="http://schemas.openxmlformats.org/officeDocument/2006/relationships" xmlns:m="http://schemas.openxmlformats.org/officeDocument/2006/math" xmlns:v="urn:schemas-microsoft-com:vml" xmlns:wp14="http://schemas.microsoft.com/office/word/2010/wordprocessingDrawing" xmlns:wp="http://schemas.openxmlformats.org/drawingml/2006/wordprocessingDrawing" xmlns:w10="urn:schemas-microsoft-com:office:word" xmlns:w="http://schemas.openxmlformats.org/wordprocessingml/2006/main" xmlns:w14="http://schemas.microsoft.com/office/word/2010/wordml" xmlns:w15="http://schemas.microsoft.com/office/word/2012/wordml" xmlns:w16cei="http://schemas.microsoft.com/office/word/2026/wordml/cei" xmlns:w16cex="http://schemas.microsoft.com/office/word/2018/wordml/cex" xmlns:w16cid="http://schemas.microsoft.com/office/word/2016/wordml/cid" xmlns:w16="http://schemas.microsoft.com/office/word/2018/wordml" xmlns:w16du="http://schemas.microsoft.com/office/word/2023/wordml/word16du" xmlns:w16sdtdh="http://schemas.microsoft.com/office/word/2020/wordml/sdtdatahash" xmlns:w16sdtfl="http://schemas.microsoft.com/office/word/2024/wordml/sdtformatlock" xmlns:w16se="http://schemas.microsoft.com/office/word/2015/wordml/symex" xmlns:wpg="http://schemas.microsoft.com/office/word/2010/wordprocessingGroup" xmlns:wpi="http://schemas.microsoft.com/office/word/2010/wordprocessingInk" xmlns:wne="http://schemas.microsoft.com/office/word/2006/wordml" xmlns:wps="http://schemas.microsoft.com/office/word/2010/wordprocessingShape" mc:Ignorable="w14 w15 w16se w16cid w16 w16cex w16sdtdh w16sdtfl w16du wp14">
+<w:numbering xmlns:wpc="http://schemas.microsoft.com/office/word/2010/wordprocessingCanvas" xmlns:cx="http://schemas.microsoft.com/office/drawing/2014/chartex" xmlns:cx1="http://schemas.microsoft.com/office/drawing/2015/9/8/chartex" xmlns:cx2="http://schemas.microsoft.com/office/drawing/2015/10/21/chartex" xmlns:cx3="http://schemas.microsoft.com/office/drawing/2016/5/9/chartex" xmlns:cx4="http://schemas.microsoft.com/office/drawing/2016/5/10/chartex" xmlns:cx5="http://schemas.microsoft.com/office/drawing/2016/5/11/chartex" xmlns:cx6="http://schemas.microsoft.com/office/drawing/2016/5/12/chartex" xmlns:cx7="http://schemas.microsoft.com/office/drawing/2016/5/13/chartex" xmlns:cx8="http://schemas.microsoft.com/office/drawing/2016/5/14/chartex" xmlns:mc="http://schemas.openxmlformats.org/markup-compatibility/2006" xmlns:aink="http://schemas.microsoft.com/office/drawing/2016/ink" xmlns:am3d="http://schemas.microsoft.com/office/drawing/2017/model3d" xmlns:o="urn:schemas-microsoft-com:office:office" xmlns:oel="http://schemas.microsoft.com/office/2019/extlst" xmlns:r="http://schemas.openxmlformats.org/officeDocument/2006/relationships" xmlns:m="http://schemas.openxmlformats.org/officeDocument/2006/math" xmlns:v="urn:schemas-microsoft-com:vml" xmlns:wp14="http://schemas.microsoft.com/office/word/2010/wordprocessingDrawing" xmlns:wp="http://schemas.openxmlformats.org/drawingml/2006/wordprocessingDrawing" xmlns:w10="urn:schemas-microsoft-com:office:word" xmlns:w="http://schemas.openxmlformats.org/wordprocessingml/2006/main" xmlns:w14="http://schemas.microsoft.com/office/word/2010/wordml" xmlns:w15="http://schemas.microsoft.com/office/word/2012/wordml" xmlns:w16cex="http://schemas.microsoft.com/office/word/2018/wordml/cex" xmlns:w16cid="http://schemas.microsoft.com/office/word/2016/wordml/cid" xmlns:w16="http://schemas.microsoft.com/office/word/2018/wordml" xmlns:w16du="http://schemas.microsoft.com/office/word/2023/wordml/word16du" xmlns:w16sdtdh="http://schemas.microsoft.com/office/word/2020/wordml/sdtdatahash" xmlns:w16sdtfl="http://schemas.microsoft.com/office/word/2024/wordml/sdtformatlock" xmlns:w16se="http://schemas.microsoft.com/office/word/2015/wordml/symex" xmlns:wpg="http://schemas.microsoft.com/office/word/2010/wordprocessingGroup" xmlns:wpi="http://schemas.microsoft.com/office/word/2010/wordprocessingInk" xmlns:wne="http://schemas.microsoft.com/office/word/2006/wordml" xmlns:wps="http://schemas.microsoft.com/office/word/2010/wordprocessingShape" mc:Ignorable="w14 w15 w16se w16cid w16 w16cex w16sdtdh w16sdtfl w16du wp14">
   <w:abstractNum w:abstractNumId="0" w15:restartNumberingAfterBreak="0">
     <w:nsid w:val="14C173C6"/>
     <w:multiLevelType w:val="hybridMultilevel"/>
@@ -1241,6 +1807,7 @@
   <w:style w:type="character" w:default="1" w:styleId="DefaultParagraphFont">
     <w:name w:val="Default Paragraph Font"/>
     <w:uiPriority w:val="1"/>
+    <w:semiHidden/>
     <w:unhideWhenUsed/>
   </w:style>
   <w:style w:type="table" w:default="1" w:styleId="TableNormal">

</xml_diff>